<commit_message>
Updated CV with EUKS Express live system
</commit_message>
<xml_diff>
--- a/GODWIN_AUTHOR_CV_2025.docx
+++ b/GODWIN_AUTHOR_CV_2025.docx
@@ -98,7 +98,7 @@
     </w:p>
     <w:p>
       <w:r>
-        <w:t>Backend Engineer turned Founder with a proven track record of building production-ready systems that generate real revenue. From freelance developer to building a complete digital ecosystem, I bring hands-on expertise in securing financial transactions, managing high-volume data, and architecting scalable microservices. Currently leading ESTECH - a comprehensive digital ecosystem featuring authentication, learning management, recruitment, and payment infrastructure.</w:t>
+        <w:t>Backend Engineer turned Founder with a proven track record of building production-ready systems that generate real revenue. Currently leading ESTECH Digital Ecosystem and EUKS Express - both live platforms serving real businesses. Hands-on expertise in securing financial transactions, payment processing, and architecting scalable systems.</w:t>
       </w:r>
     </w:p>
     <w:p>
@@ -156,7 +156,7 @@
         <w:rPr>
           <w:sz w:val="20"/>
         </w:rPr>
-        <w:t>Revenue-Generating Systems — Payment integration, financial platforms</w:t>
+        <w:t>Revenue-Generating Systems — EUKS Express delivery platform, payment integration</w:t>
       </w:r>
     </w:p>
     <w:p>
@@ -184,9 +184,122 @@
           <w:color w:val="00529B"/>
           <w:sz w:val="22"/>
         </w:rPr>
-        <w:t>PRODUCTION SYSTEMS (LIVE &amp; REVENUE-GENERATING)</w:t>
+        <w:t>LIVE PRODUCTION SYSTEMS (REVENUE-GENERATING)</w:t>
       </w:r>
     </w:p>
+    <w:p>
+      <w:r>
+        <w:rPr>
+          <w:b/>
+          <w:color w:val="00529B"/>
+          <w:sz w:val="22"/>
+        </w:rPr>
+        <w:t>EUKS Express - Delivery Management Platform</w:t>
+      </w:r>
+      <w:r>
+        <w:rPr>
+          <w:color w:val="10B981"/>
+          <w:sz w:val="18"/>
+        </w:rPr>
+        <w:t xml:space="preserve"> | LIVE</w:t>
+      </w:r>
+    </w:p>
+    <w:p>
+      <w:pPr>
+        <w:pStyle w:val="ListBullet"/>
+      </w:pPr>
+      <w:r>
+        <w:rPr>
+          <w:b/>
+          <w:color w:val="3B82F6"/>
+          <w:sz w:val="20"/>
+        </w:rPr>
+        <w:t xml:space="preserve">What I Built: </w:t>
+      </w:r>
+      <w:r>
+        <w:rPr>
+          <w:sz w:val="20"/>
+        </w:rPr>
+        <w:t>Complete delivery platform with booking, tracking, and payment</w:t>
+      </w:r>
+    </w:p>
+    <w:p>
+      <w:pPr>
+        <w:pStyle w:val="ListBullet"/>
+      </w:pPr>
+      <w:r>
+        <w:rPr>
+          <w:b/>
+          <w:color w:val="3B82F6"/>
+          <w:sz w:val="20"/>
+        </w:rPr>
+        <w:t xml:space="preserve">Status: </w:t>
+      </w:r>
+      <w:r>
+        <w:rPr>
+          <w:sz w:val="20"/>
+        </w:rPr>
+        <w:t>Live at eukexpress.com | Currently generating revenue</w:t>
+      </w:r>
+    </w:p>
+    <w:p>
+      <w:pPr>
+        <w:pStyle w:val="ListBullet"/>
+      </w:pPr>
+      <w:r>
+        <w:rPr>
+          <w:b/>
+          <w:color w:val="3B82F6"/>
+          <w:sz w:val="20"/>
+        </w:rPr>
+        <w:t xml:space="preserve">Features: </w:t>
+      </w:r>
+      <w:r>
+        <w:rPr>
+          <w:sz w:val="20"/>
+        </w:rPr>
+        <w:t>Booking system, real-time tracking, payment integration</w:t>
+      </w:r>
+    </w:p>
+    <w:p>
+      <w:pPr>
+        <w:pStyle w:val="ListBullet"/>
+      </w:pPr>
+      <w:r>
+        <w:rPr>
+          <w:b/>
+          <w:color w:val="3B82F6"/>
+          <w:sz w:val="20"/>
+        </w:rPr>
+        <w:t xml:space="preserve">Business Model: </w:t>
+      </w:r>
+      <w:r>
+        <w:rPr>
+          <w:sz w:val="20"/>
+        </w:rPr>
+        <w:t>B2C delivery service</w:t>
+      </w:r>
+    </w:p>
+    <w:p>
+      <w:pPr>
+        <w:pStyle w:val="ListBullet"/>
+      </w:pPr>
+      <w:r>
+        <w:rPr>
+          <w:b/>
+          <w:color w:val="3B82F6"/>
+          <w:sz w:val="20"/>
+        </w:rPr>
+        <w:t xml:space="preserve">Tech Stack: </w:t>
+      </w:r>
+      <w:r>
+        <w:rPr>
+          <w:sz w:val="20"/>
+        </w:rPr>
+        <w:t>Node.js, Express, MongoDB, Payment Gateway</w:t>
+      </w:r>
+    </w:p>
+    <w:p/>
     <w:p>
       <w:r>
         <w:rPr>
@@ -198,9 +311,9 @@
       </w:r>
       <w:r>
         <w:rPr>
-          <w:sz w:val="20"/>
+          <w:sz w:val="18"/>
         </w:rPr>
-        <w:t xml:space="preserve"> | Full-Stack Digital Platform</w:t>
+        <w:t xml:space="preserve"> | Live &amp; Revenue-Generating</w:t>
       </w:r>
     </w:p>
     <w:p>
@@ -238,7 +351,7 @@
         <w:rPr>
           <w:sz w:val="20"/>
         </w:rPr>
-        <w:t>Enterprise authentication (OAuth2, JWT, 2FA) serving multiple applications</w:t>
+        <w:t>Enterprise authentication (OAuth2, JWT, 2FA)</w:t>
       </w:r>
     </w:p>
     <w:p>
@@ -276,7 +389,7 @@
         <w:rPr>
           <w:sz w:val="20"/>
         </w:rPr>
-        <w:t>Intelligent recruitment with CV analysis and AI recommendations</w:t>
+        <w:t>Intelligent recruitment with CV analysis &amp; AI recommendations</w:t>
       </w:r>
     </w:p>
     <w:p>
@@ -298,25 +411,6 @@
         <w:t>FastAPI + React + PostgreSQL + Redis + Docker</w:t>
       </w:r>
     </w:p>
-    <w:p>
-      <w:pPr>
-        <w:pStyle w:val="ListBullet"/>
-      </w:pPr>
-      <w:r>
-        <w:rPr>
-          <w:b/>
-          <w:color w:val="3B82F6"/>
-          <w:sz w:val="20"/>
-        </w:rPr>
-        <w:t xml:space="preserve">Status: </w:t>
-      </w:r>
-      <w:r>
-        <w:rPr>
-          <w:sz w:val="20"/>
-        </w:rPr>
-        <w:t>Live at estech.cloud (business intelligence classified)</w:t>
-      </w:r>
-    </w:p>
     <w:p/>
     <w:p>
       <w:r>
@@ -331,7 +425,7 @@
         <w:rPr>
           <w:sz w:val="20"/>
         </w:rPr>
-        <w:t xml:space="preserve"> | Security Company Management Platform</w:t>
+        <w:t xml:space="preserve"> | Security Company Platform</w:t>
       </w:r>
     </w:p>
     <w:p>
@@ -350,7 +444,7 @@
         <w:rPr>
           <w:sz w:val="20"/>
         </w:rPr>
-        <w:t>End-to-end platform for NSCDC-licensed security company across 16+ states</w:t>
+        <w:t>Platform for NSCDC-licensed security company across 16+ states</w:t>
       </w:r>
     </w:p>
     <w:p>
@@ -369,7 +463,7 @@
         <w:rPr>
           <w:sz w:val="20"/>
         </w:rPr>
-        <w:t>Role-based access control, reporting modules, incident management</w:t>
+        <w:t>RBAC, reporting, incident management, authentication</w:t>
       </w:r>
     </w:p>
     <w:p>
@@ -382,45 +476,7 @@
           <w:color w:val="3B82F6"/>
           <w:sz w:val="20"/>
         </w:rPr>
-        <w:t xml:space="preserve">Security: </w:t>
-      </w:r>
-      <w:r>
-        <w:rPr>
-          <w:sz w:val="20"/>
-        </w:rPr>
-        <w:t>Complete authentication and user management system</w:t>
-      </w:r>
-    </w:p>
-    <w:p>
-      <w:pPr>
-        <w:pStyle w:val="ListBullet"/>
-      </w:pPr>
-      <w:r>
-        <w:rPr>
-          <w:b/>
-          <w:color w:val="3B82F6"/>
-          <w:sz w:val="20"/>
-        </w:rPr>
-        <w:t xml:space="preserve">Tech Stack: </w:t>
-      </w:r>
-      <w:r>
-        <w:rPr>
-          <w:sz w:val="20"/>
-        </w:rPr>
-        <w:t>Node.js, Express, MongoDB</w:t>
-      </w:r>
-    </w:p>
-    <w:p>
-      <w:pPr>
-        <w:pStyle w:val="ListBullet"/>
-      </w:pPr>
-      <w:r>
-        <w:rPr>
-          <w:b/>
-          <w:color w:val="3B82F6"/>
-          <w:sz w:val="20"/>
-        </w:rPr>
-        <w:t xml:space="preserve">Live Link: </w:t>
+        <w:t xml:space="preserve">Live: </w:t>
       </w:r>
       <w:r>
         <w:rPr>
@@ -482,26 +538,7 @@
         <w:rPr>
           <w:sz w:val="20"/>
         </w:rPr>
-        <w:t>Encrypted transactions, secure authentication, compliance features</w:t>
-      </w:r>
-    </w:p>
-    <w:p>
-      <w:pPr>
-        <w:pStyle w:val="ListBullet"/>
-      </w:pPr>
-      <w:r>
-        <w:rPr>
-          <w:b/>
-          <w:color w:val="3B82F6"/>
-          <w:sz w:val="20"/>
-        </w:rPr>
-        <w:t xml:space="preserve">Scale: </w:t>
-      </w:r>
-      <w:r>
-        <w:rPr>
-          <w:sz w:val="20"/>
-        </w:rPr>
-        <w:t>High-volume transaction processing with bank-grade security</w:t>
+        <w:t>Encrypted transactions, secure authentication, compliance</w:t>
       </w:r>
     </w:p>
     <w:p>
@@ -597,7 +634,7 @@
         <w:rPr>
           <w:sz w:val="20"/>
         </w:rPr>
-        <w:t>Payment gateway integration, Transaction processing, Financial security</w:t>
+        <w:t>Payment gateway integration, Transaction processing</w:t>
       </w:r>
     </w:p>
     <w:p>
@@ -614,22 +651,6 @@
           <w:sz w:val="20"/>
         </w:rPr>
         <w:t>Docker, CI/CD, Linux, Cloudflare, AWS basics, Render</w:t>
-      </w:r>
-    </w:p>
-    <w:p>
-      <w:r>
-        <w:rPr>
-          <w:b/>
-          <w:color w:val="3B82F6"/>
-          <w:sz w:val="20"/>
-        </w:rPr>
-        <w:t xml:space="preserve">▸ System Architecture: </w:t>
-      </w:r>
-      <w:r>
-        <w:rPr>
-          <w:sz w:val="20"/>
-        </w:rPr>
-        <w:t>Microservices, API design, Technical documentation</w:t>
       </w:r>
     </w:p>
     <w:p>
@@ -654,13 +675,31 @@
           <w:b/>
           <w:sz w:val="20"/>
         </w:rPr>
-        <w:t xml:space="preserve">Production-Ready Systems: </w:t>
+        <w:t xml:space="preserve">Live Revenue Systems: </w:t>
       </w:r>
       <w:r>
         <w:rPr>
           <w:sz w:val="20"/>
         </w:rPr>
-        <w:t>Built and deployed systems currently generating revenue</w:t>
+        <w:t>EUKS Express and ESTECH currently generating revenue</w:t>
+      </w:r>
+    </w:p>
+    <w:p>
+      <w:pPr>
+        <w:pStyle w:val="ListBullet"/>
+      </w:pPr>
+      <w:r>
+        <w:rPr>
+          <w:b/>
+          <w:sz w:val="20"/>
+        </w:rPr>
+        <w:t xml:space="preserve">Production-Ready: </w:t>
+      </w:r>
+      <w:r>
+        <w:rPr>
+          <w:sz w:val="20"/>
+        </w:rPr>
+        <w:t>Built and deployed systems serving real businesses</w:t>
       </w:r>
     </w:p>
     <w:p>
@@ -678,7 +717,7 @@
         <w:rPr>
           <w:sz w:val="20"/>
         </w:rPr>
-        <w:t>Implemented security measures maintaining integrity in production</w:t>
+        <w:t>Implemented security maintaining integrity in production</w:t>
       </w:r>
     </w:p>
     <w:p>
@@ -696,43 +735,7 @@
         <w:rPr>
           <w:sz w:val="20"/>
         </w:rPr>
-        <w:t>Built payment control systems handling real financial transactions</w:t>
-      </w:r>
-    </w:p>
-    <w:p>
-      <w:pPr>
-        <w:pStyle w:val="ListBullet"/>
-      </w:pPr>
-      <w:r>
-        <w:rPr>
-          <w:b/>
-          <w:sz w:val="20"/>
-        </w:rPr>
-        <w:t xml:space="preserve">Autonomous Ecosystem: </w:t>
-      </w:r>
-      <w:r>
-        <w:rPr>
-          <w:sz w:val="20"/>
-        </w:rPr>
-        <w:t>Architected complete digital ecosystem from ground up</w:t>
-      </w:r>
-    </w:p>
-    <w:p>
-      <w:pPr>
-        <w:pStyle w:val="ListBullet"/>
-      </w:pPr>
-      <w:r>
-        <w:rPr>
-          <w:b/>
-          <w:sz w:val="20"/>
-        </w:rPr>
-        <w:t xml:space="preserve">Enterprise Client: </w:t>
-      </w:r>
-      <w:r>
-        <w:rPr>
-          <w:sz w:val="20"/>
-        </w:rPr>
-        <w:t>Delivered solutions for NSCDC-licensed security firm</w:t>
+        <w:t>Built payment systems handling real financial transactions</w:t>
       </w:r>
     </w:p>
     <w:p>

</xml_diff>